<commit_message>
feat: add initial data quality analysis notebook
</commit_message>
<xml_diff>
--- a/docs/business/Machine Learning Canvas.docx
+++ b/docs/business/Machine Learning Canvas.docx
@@ -127,20 +127,8 @@
           <w:szCs w:val="16"/>
           <w:highlight w:val="white"/>
         </w:rPr>
-        <w:t xml:space="preserve">      </w:t>
+        <w:t xml:space="preserve">        .</w:t>
       </w:r>
-      <w:proofErr w:type="gramStart"/>
-      <w:r>
-        <w:rPr>
-          <w:b w:val="0"/>
-          <w:color w:val="999999"/>
-          <w:sz w:val="16"/>
-          <w:szCs w:val="16"/>
-          <w:highlight w:val="white"/>
-        </w:rPr>
-        <w:t xml:space="preserve">  .</w:t>
-      </w:r>
-      <w:proofErr w:type="gramEnd"/>
     </w:p>
     <w:tbl>
       <w:tblPr>
@@ -258,7 +246,6 @@
               <w:spacing w:after="200"/>
               <w:rPr>
                 <w:color w:val="auto"/>
-                <w:lang w:val="es-PE"/>
               </w:rPr>
             </w:pPr>
             <w:bookmarkStart w:id="2" w:name="_bpp37yij3fth" w:colFirst="0" w:colLast="0"/>
@@ -417,21 +404,7 @@
               <w:rPr>
                 <w:lang w:val="es-PE"/>
               </w:rPr>
-              <w:t xml:space="preserve">esto es el tiempo </w:t>
-            </w:r>
-            <w:proofErr w:type="gramStart"/>
-            <w:r>
-              <w:rPr>
-                <w:lang w:val="es-PE"/>
-              </w:rPr>
-              <w:t>promedio</w:t>
-            </w:r>
-            <w:proofErr w:type="gramEnd"/>
-            <w:r>
-              <w:rPr>
-                <w:lang w:val="es-PE"/>
-              </w:rPr>
-              <w:t xml:space="preserve"> pero no es fijo</w:t>
+              <w:t>esto es el tiempo promedio pero no es fijo</w:t>
             </w:r>
             <w:r>
               <w:rPr>
@@ -547,6 +520,7 @@
               <w:spacing w:after="200"/>
               <w:rPr>
                 <w:color w:val="999999"/>
+                <w:lang w:val="es-PE"/>
               </w:rPr>
             </w:pPr>
             <w:bookmarkStart w:id="4" w:name="_i67ms1frpt13" w:colFirst="0" w:colLast="0"/>
@@ -555,7 +529,14 @@
               <w:rPr>
                 <w:color w:val="999999"/>
               </w:rPr>
-              <w:t>How are predictions turned into proposed value for the end-user? Mention parameters of the process / application that does that.</w:t>
+              <w:t xml:space="preserve">How are predictions turned into proposed value for the end-user? </w:t>
+            </w:r>
+            <w:r>
+              <w:rPr>
+                <w:color w:val="999999"/>
+                <w:lang w:val="es-PE"/>
+              </w:rPr>
+              <w:t>Mention parameters of the process / application that does that.</w:t>
             </w:r>
           </w:p>
           <w:p>
@@ -579,7 +560,21 @@
                 <w:rFonts w:ascii="Caveat" w:eastAsia="Caveat" w:hAnsi="Caveat" w:cs="Caveat"/>
                 <w:lang w:val="es-PE"/>
               </w:rPr>
-              <w:t>La probabilidad de fraude predicha se utiliza para priorizar las acciones del sistema antifraude. Una transacción con riesgo muy alto puede bloquearse preventivamente y enviarse a revisión inmediata. Un riesgo intermedio puede activar una autenticación adicional o una revisión diferida, mientras que una probabilidad baja permite aprobar automáticamente la operación, reduciendo fricción para clientes legítimos</w:t>
+              <w:t>La probabilidad de fraude predicha se utiliza para priorizar las acciones del sistema antifraude. Una transacción con riesgo muy alto puede bloquearse preventivamente y enviarse a revisión inmediata. Un riesgo intermedio puede activar una autenticación adicional o una revisión diferida</w:t>
+            </w:r>
+            <w:r>
+              <w:rPr>
+                <w:rFonts w:ascii="Caveat" w:eastAsia="Caveat" w:hAnsi="Caveat" w:cs="Caveat"/>
+                <w:lang w:val="es-PE"/>
+              </w:rPr>
+              <w:t xml:space="preserve"> o derivarlo al equipo de fraudes</w:t>
+            </w:r>
+            <w:r>
+              <w:rPr>
+                <w:rFonts w:ascii="Caveat" w:eastAsia="Caveat" w:hAnsi="Caveat" w:cs="Caveat"/>
+                <w:lang w:val="es-PE"/>
+              </w:rPr>
+              <w:t>, mientras que una probabilidad baja permite aprobar automáticamente la operación, reduciendo fricción para clientes legítimos</w:t>
             </w:r>
             <w:r>
               <w:rPr>
@@ -726,23 +721,7 @@
                 <w:color w:val="999999"/>
                 <w:lang w:val="es-PE"/>
               </w:rPr>
-              <w:t xml:space="preserve">Mention </w:t>
-            </w:r>
-            <w:proofErr w:type="spellStart"/>
-            <w:r>
-              <w:rPr>
-                <w:color w:val="999999"/>
-                <w:lang w:val="es-PE"/>
-              </w:rPr>
-              <w:t>workflow</w:t>
-            </w:r>
-            <w:proofErr w:type="spellEnd"/>
-            <w:r>
-              <w:rPr>
-                <w:color w:val="999999"/>
-                <w:lang w:val="es-PE"/>
-              </w:rPr>
-              <w:t>/interfaces.</w:t>
+              <w:t>Mention workflow/interfaces.</w:t>
             </w:r>
           </w:p>
           <w:p>
@@ -754,12 +733,29 @@
                 <w:lang w:val="es-PE"/>
               </w:rPr>
             </w:pPr>
-            <w:r>
-              <w:rPr>
-                <w:rFonts w:ascii="Caveat" w:eastAsia="Caveat" w:hAnsi="Caveat" w:cs="Caveat"/>
-                <w:lang w:val="es-PE"/>
-              </w:rPr>
-              <w:t>Usuario Final:</w:t>
+            <w:commentRangeStart w:id="7"/>
+            <w:r>
+              <w:rPr>
+                <w:rFonts w:ascii="Caveat" w:eastAsia="Caveat" w:hAnsi="Caveat" w:cs="Caveat"/>
+                <w:lang w:val="es-PE"/>
+              </w:rPr>
+              <w:t>Usuario Final</w:t>
+            </w:r>
+            <w:commentRangeEnd w:id="7"/>
+            <w:r>
+              <w:rPr>
+                <w:rStyle w:val="Refdecomentario"/>
+                <w:rFonts w:ascii="Caveat" w:eastAsia="Caveat" w:hAnsi="Caveat" w:cs="Caveat"/>
+                <w:lang w:val="es-PE"/>
+              </w:rPr>
+              <w:commentReference w:id="7"/>
+            </w:r>
+            <w:r>
+              <w:rPr>
+                <w:rFonts w:ascii="Caveat" w:eastAsia="Caveat" w:hAnsi="Caveat" w:cs="Caveat"/>
+                <w:lang w:val="es-PE"/>
+              </w:rPr>
+              <w:t>:</w:t>
             </w:r>
             <w:r>
               <w:rPr>
@@ -772,23 +768,7 @@
                 <w:rFonts w:ascii="Caveat" w:eastAsia="Caveat" w:hAnsi="Caveat" w:cs="Caveat"/>
                 <w:lang w:val="es-PE"/>
               </w:rPr>
-              <w:t xml:space="preserve">Equipo Antifraude, Analistas de Riesgo y Centro de Monitoreo de Transacciones de </w:t>
-            </w:r>
-            <w:proofErr w:type="spellStart"/>
-            <w:r>
-              <w:rPr>
-                <w:rFonts w:ascii="Caveat" w:eastAsia="Caveat" w:hAnsi="Caveat" w:cs="Caveat"/>
-                <w:lang w:val="es-PE"/>
-              </w:rPr>
-              <w:t>GlobalBank</w:t>
-            </w:r>
-            <w:proofErr w:type="spellEnd"/>
-            <w:r>
-              <w:rPr>
-                <w:rFonts w:ascii="Caveat" w:eastAsia="Caveat" w:hAnsi="Caveat" w:cs="Caveat"/>
-                <w:lang w:val="es-PE"/>
-              </w:rPr>
-              <w:t>.</w:t>
+              <w:t>Equipo Antifraude, Analistas de Riesgo y Centro de Monitoreo de Transacciones de GlobalBank.</w:t>
             </w:r>
           </w:p>
           <w:p>
@@ -931,64 +911,9 @@
             <w:r>
               <w:rPr>
                 <w:rFonts w:ascii="Caveat" w:eastAsia="Caveat" w:hAnsi="Caveat" w:cs="Caveat"/>
-              </w:rPr>
-              <w:t xml:space="preserve">• </w:t>
-            </w:r>
-            <w:proofErr w:type="spellStart"/>
-            <w:r>
-              <w:rPr>
-                <w:rFonts w:ascii="Caveat" w:eastAsia="Caveat" w:hAnsi="Caveat" w:cs="Caveat"/>
-              </w:rPr>
-              <w:t>Incrementar</w:t>
-            </w:r>
-            <w:proofErr w:type="spellEnd"/>
-            <w:r>
-              <w:rPr>
-                <w:rFonts w:ascii="Caveat" w:eastAsia="Caveat" w:hAnsi="Caveat" w:cs="Caveat"/>
-              </w:rPr>
-              <w:t xml:space="preserve"> la confianza </w:t>
-            </w:r>
-            <w:proofErr w:type="spellStart"/>
-            <w:r>
-              <w:rPr>
-                <w:rFonts w:ascii="Caveat" w:eastAsia="Caveat" w:hAnsi="Caveat" w:cs="Caveat"/>
-              </w:rPr>
-              <w:t>en</w:t>
-            </w:r>
-            <w:proofErr w:type="spellEnd"/>
-            <w:r>
-              <w:rPr>
-                <w:rFonts w:ascii="Caveat" w:eastAsia="Caveat" w:hAnsi="Caveat" w:cs="Caveat"/>
-              </w:rPr>
-              <w:t xml:space="preserve"> </w:t>
-            </w:r>
-            <w:proofErr w:type="spellStart"/>
-            <w:r>
-              <w:rPr>
-                <w:rFonts w:ascii="Caveat" w:eastAsia="Caveat" w:hAnsi="Caveat" w:cs="Caveat"/>
-              </w:rPr>
-              <w:t>los</w:t>
-            </w:r>
-            <w:proofErr w:type="spellEnd"/>
-            <w:r>
-              <w:rPr>
-                <w:rFonts w:ascii="Caveat" w:eastAsia="Caveat" w:hAnsi="Caveat" w:cs="Caveat"/>
-              </w:rPr>
-              <w:t xml:space="preserve"> canales </w:t>
-            </w:r>
-            <w:proofErr w:type="spellStart"/>
-            <w:r>
-              <w:rPr>
-                <w:rFonts w:ascii="Caveat" w:eastAsia="Caveat" w:hAnsi="Caveat" w:cs="Caveat"/>
-              </w:rPr>
-              <w:t>digitales</w:t>
-            </w:r>
-            <w:proofErr w:type="spellEnd"/>
-            <w:r>
-              <w:rPr>
-                <w:rFonts w:ascii="Caveat" w:eastAsia="Caveat" w:hAnsi="Caveat" w:cs="Caveat"/>
-              </w:rPr>
-              <w:t>.</w:t>
+                <w:lang w:val="es-PE"/>
+              </w:rPr>
+              <w:t>• Incrementar la confianza en los canales digitales.</w:t>
             </w:r>
           </w:p>
           <w:p>
@@ -1022,23 +947,7 @@
                 <w:rFonts w:ascii="Caveat" w:eastAsia="Caveat" w:hAnsi="Caveat" w:cs="Caveat"/>
                 <w:lang w:val="es-PE"/>
               </w:rPr>
-              <w:t xml:space="preserve">Cada transacción es evaluada por el modelo de Machine </w:t>
-            </w:r>
-            <w:proofErr w:type="spellStart"/>
-            <w:r>
-              <w:rPr>
-                <w:rFonts w:ascii="Caveat" w:eastAsia="Caveat" w:hAnsi="Caveat" w:cs="Caveat"/>
-                <w:lang w:val="es-PE"/>
-              </w:rPr>
-              <w:t>Learning</w:t>
-            </w:r>
-            <w:proofErr w:type="spellEnd"/>
-            <w:r>
-              <w:rPr>
-                <w:rFonts w:ascii="Caveat" w:eastAsia="Caveat" w:hAnsi="Caveat" w:cs="Caveat"/>
-                <w:lang w:val="es-PE"/>
-              </w:rPr>
-              <w:t>, que genera un score de probabilidad de fraude. Este score alimenta el motor de decisiones del banco, el cual aprueba la transacción, solicita autenticación adicional o la deriva al equipo antifraude para revisión, integrándose con los sistemas de monitoreo y gestión de alertas.</w:t>
+              <w:t>Cada transacción es evaluada por el modelo de Machine Learning, que genera un score de probabilidad de fraude. Este score alimenta el motor de decisiones del banco, el cual aprueba la transacción, solicita autenticación adicional o la deriva al equipo antifraude para revisión, integrándose con los sistemas de monitoreo y gestión de alertas.</w:t>
             </w:r>
           </w:p>
           <w:p>
@@ -1078,8 +987,8 @@
                 <w:szCs w:val="20"/>
               </w:rPr>
             </w:pPr>
-            <w:bookmarkStart w:id="7" w:name="_r6lslm74etum" w:colFirst="0" w:colLast="0"/>
-            <w:bookmarkEnd w:id="7"/>
+            <w:bookmarkStart w:id="8" w:name="_r6lslm74etum" w:colFirst="0" w:colLast="0"/>
+            <w:bookmarkEnd w:id="8"/>
             <w:r>
               <w:rPr>
                 <w:sz w:val="20"/>
@@ -1110,355 +1019,6 @@
                       <pic:pic xmlns:pic="http://schemas.openxmlformats.org/drawingml/2006/picture">
                         <pic:nvPicPr>
                           <pic:cNvPr id="0" name="image9.png"/>
-                          <pic:cNvPicPr preferRelativeResize="0"/>
-                        </pic:nvPicPr>
-                        <pic:blipFill>
-                          <a:blip r:embed="rId8"/>
-                          <a:srcRect/>
-                          <a:stretch>
-                            <a:fillRect/>
-                          </a:stretch>
-                        </pic:blipFill>
-                        <pic:spPr>
-                          <a:xfrm>
-                            <a:off x="0" y="0"/>
-                            <a:ext cx="324000" cy="324000"/>
-                          </a:xfrm>
-                          <a:prstGeom prst="rect">
-                            <a:avLst/>
-                          </a:prstGeom>
-                          <a:ln/>
-                        </pic:spPr>
-                      </pic:pic>
-                    </a:graphicData>
-                  </a:graphic>
-                </wp:anchor>
-              </w:drawing>
-            </w:r>
-          </w:p>
-          <w:p>
-            <w:pPr>
-              <w:pStyle w:val="Ttulo3"/>
-              <w:spacing w:after="200"/>
-              <w:rPr>
-                <w:color w:val="999999"/>
-              </w:rPr>
-            </w:pPr>
-            <w:bookmarkStart w:id="8" w:name="_ft6fsaayq5ku" w:colFirst="0" w:colLast="0"/>
-            <w:bookmarkEnd w:id="8"/>
-            <w:r>
-              <w:rPr>
-                <w:color w:val="999999"/>
-              </w:rPr>
-              <w:t>Strategy for initial train set &amp; continuous update. Mention collection rate, holdout on production entities, cost/constraints to observe outcomes.</w:t>
-            </w:r>
-          </w:p>
-          <w:p>
-            <w:pPr>
-              <w:spacing w:after="200"/>
-              <w:jc w:val="left"/>
-              <w:rPr>
-                <w:sz w:val="14"/>
-                <w:szCs w:val="14"/>
-              </w:rPr>
-            </w:pPr>
-          </w:p>
-        </w:tc>
-        <w:tc>
-          <w:tcPr>
-            <w:tcW w:w="2880" w:type="dxa"/>
-            <w:tcBorders>
-              <w:top w:val="single" w:sz="24" w:space="0" w:color="000000"/>
-              <w:right w:val="single" w:sz="24" w:space="0" w:color="000000"/>
-            </w:tcBorders>
-            <w:shd w:val="clear" w:color="auto" w:fill="FFFFFF"/>
-            <w:tcMar>
-              <w:top w:w="100" w:type="dxa"/>
-              <w:left w:w="100" w:type="dxa"/>
-              <w:bottom w:w="100" w:type="dxa"/>
-              <w:right w:w="100" w:type="dxa"/>
-            </w:tcMar>
-          </w:tcPr>
-          <w:p>
-            <w:pPr>
-              <w:pStyle w:val="Ttulo2"/>
-              <w:rPr>
-                <w:sz w:val="20"/>
-                <w:szCs w:val="20"/>
-              </w:rPr>
-            </w:pPr>
-            <w:bookmarkStart w:id="9" w:name="_qbxvbjfgr0il" w:colFirst="0" w:colLast="0"/>
-            <w:bookmarkEnd w:id="9"/>
-            <w:r>
-              <w:rPr>
-                <w:sz w:val="20"/>
-                <w:szCs w:val="20"/>
-              </w:rPr>
-              <w:t>DATA SOURCES</w:t>
-            </w:r>
-            <w:r>
-              <w:rPr>
-                <w:noProof/>
-              </w:rPr>
-              <w:drawing>
-                <wp:anchor distT="57150" distB="57150" distL="57150" distR="57150" simplePos="0" relativeHeight="251662336" behindDoc="0" locked="0" layoutInCell="1" hidden="0" allowOverlap="1" wp14:anchorId="1460EF45" wp14:editId="1460EF46">
-                  <wp:simplePos x="0" y="0"/>
-                  <wp:positionH relativeFrom="column">
-                    <wp:posOffset>1349999</wp:posOffset>
-                  </wp:positionH>
-                  <wp:positionV relativeFrom="paragraph">
-                    <wp:posOffset>2</wp:posOffset>
-                  </wp:positionV>
-                  <wp:extent cx="324000" cy="324000"/>
-                  <wp:effectExtent l="0" t="0" r="0" b="0"/>
-                  <wp:wrapSquare wrapText="bothSides" distT="57150" distB="57150" distL="57150" distR="57150"/>
-                  <wp:docPr id="6" name="image6.png"/>
-                  <wp:cNvGraphicFramePr/>
-                  <a:graphic xmlns:a="http://schemas.openxmlformats.org/drawingml/2006/main">
-                    <a:graphicData uri="http://schemas.openxmlformats.org/drawingml/2006/picture">
-                      <pic:pic xmlns:pic="http://schemas.openxmlformats.org/drawingml/2006/picture">
-                        <pic:nvPicPr>
-                          <pic:cNvPr id="0" name="image6.png"/>
-                          <pic:cNvPicPr preferRelativeResize="0"/>
-                        </pic:nvPicPr>
-                        <pic:blipFill>
-                          <a:blip r:embed="rId9"/>
-                          <a:srcRect/>
-                          <a:stretch>
-                            <a:fillRect/>
-                          </a:stretch>
-                        </pic:blipFill>
-                        <pic:spPr>
-                          <a:xfrm>
-                            <a:off x="0" y="0"/>
-                            <a:ext cx="324000" cy="324000"/>
-                          </a:xfrm>
-                          <a:prstGeom prst="rect">
-                            <a:avLst/>
-                          </a:prstGeom>
-                          <a:ln/>
-                        </pic:spPr>
-                      </pic:pic>
-                    </a:graphicData>
-                  </a:graphic>
-                </wp:anchor>
-              </w:drawing>
-            </w:r>
-          </w:p>
-          <w:p>
-            <w:pPr>
-              <w:pStyle w:val="Ttulo3"/>
-              <w:spacing w:after="200"/>
-              <w:rPr>
-                <w:color w:val="999999"/>
-              </w:rPr>
-            </w:pPr>
-            <w:bookmarkStart w:id="10" w:name="_suo3dkmrgees" w:colFirst="0" w:colLast="0"/>
-            <w:bookmarkEnd w:id="10"/>
-            <w:r>
-              <w:rPr>
-                <w:color w:val="999999"/>
-              </w:rPr>
-              <w:t>Where can we get (raw) information on entities and observed outcomes? Mention database tables, API methods, websites to scrape, etc.</w:t>
-            </w:r>
-          </w:p>
-          <w:p>
-            <w:pPr>
-              <w:spacing w:after="200"/>
-              <w:jc w:val="left"/>
-              <w:rPr>
-                <w:i/>
-                <w:color w:val="999999"/>
-                <w:sz w:val="14"/>
-                <w:szCs w:val="14"/>
-              </w:rPr>
-            </w:pPr>
-          </w:p>
-        </w:tc>
-      </w:tr>
-      <w:tr>
-        <w:trPr>
-          <w:trHeight w:val="4215"/>
-          <w:jc w:val="center"/>
-        </w:trPr>
-        <w:tc>
-          <w:tcPr>
-            <w:tcW w:w="2955" w:type="dxa"/>
-            <w:tcBorders>
-              <w:left w:val="single" w:sz="24" w:space="0" w:color="000000"/>
-              <w:bottom w:val="nil"/>
-            </w:tcBorders>
-            <w:shd w:val="clear" w:color="auto" w:fill="FFFFFF"/>
-            <w:tcMar>
-              <w:top w:w="100" w:type="dxa"/>
-              <w:left w:w="100" w:type="dxa"/>
-              <w:bottom w:w="100" w:type="dxa"/>
-              <w:right w:w="100" w:type="dxa"/>
-            </w:tcMar>
-          </w:tcPr>
-          <w:p>
-            <w:pPr>
-              <w:pStyle w:val="Ttulo2"/>
-              <w:rPr>
-                <w:sz w:val="20"/>
-                <w:szCs w:val="20"/>
-              </w:rPr>
-            </w:pPr>
-            <w:bookmarkStart w:id="11" w:name="_gavc6auq90os" w:colFirst="0" w:colLast="0"/>
-            <w:bookmarkEnd w:id="11"/>
-            <w:r>
-              <w:rPr>
-                <w:sz w:val="20"/>
-                <w:szCs w:val="20"/>
-              </w:rPr>
-              <w:lastRenderedPageBreak/>
-              <w:t>IMPACT SIMULATION</w:t>
-            </w:r>
-            <w:r>
-              <w:rPr>
-                <w:noProof/>
-              </w:rPr>
-              <w:drawing>
-                <wp:anchor distT="57150" distB="57150" distL="57150" distR="57150" simplePos="0" relativeHeight="251663360" behindDoc="0" locked="0" layoutInCell="1" hidden="0" allowOverlap="1" wp14:anchorId="1460EF47" wp14:editId="1460EF48">
-                  <wp:simplePos x="0" y="0"/>
-                  <wp:positionH relativeFrom="column">
-                    <wp:posOffset>1385999</wp:posOffset>
-                  </wp:positionH>
-                  <wp:positionV relativeFrom="paragraph">
-                    <wp:posOffset>2</wp:posOffset>
-                  </wp:positionV>
-                  <wp:extent cx="324000" cy="324000"/>
-                  <wp:effectExtent l="0" t="0" r="0" b="0"/>
-                  <wp:wrapSquare wrapText="bothSides" distT="57150" distB="57150" distL="57150" distR="57150"/>
-                  <wp:docPr id="1" name="image1.png"/>
-                  <wp:cNvGraphicFramePr/>
-                  <a:graphic xmlns:a="http://schemas.openxmlformats.org/drawingml/2006/main">
-                    <a:graphicData uri="http://schemas.openxmlformats.org/drawingml/2006/picture">
-                      <pic:pic xmlns:pic="http://schemas.openxmlformats.org/drawingml/2006/picture">
-                        <pic:nvPicPr>
-                          <pic:cNvPr id="0" name="image1.png"/>
-                          <pic:cNvPicPr preferRelativeResize="0"/>
-                        </pic:nvPicPr>
-                        <pic:blipFill>
-                          <a:blip r:embed="rId10"/>
-                          <a:srcRect/>
-                          <a:stretch>
-                            <a:fillRect/>
-                          </a:stretch>
-                        </pic:blipFill>
-                        <pic:spPr>
-                          <a:xfrm>
-                            <a:off x="0" y="0"/>
-                            <a:ext cx="324000" cy="324000"/>
-                          </a:xfrm>
-                          <a:prstGeom prst="rect">
-                            <a:avLst/>
-                          </a:prstGeom>
-                          <a:ln/>
-                        </pic:spPr>
-                      </pic:pic>
-                    </a:graphicData>
-                  </a:graphic>
-                </wp:anchor>
-              </w:drawing>
-            </w:r>
-          </w:p>
-          <w:p>
-            <w:pPr>
-              <w:pStyle w:val="Ttulo3"/>
-              <w:spacing w:after="200"/>
-              <w:rPr>
-                <w:color w:val="999999"/>
-              </w:rPr>
-            </w:pPr>
-            <w:bookmarkStart w:id="12" w:name="_p0v095vyqr5l" w:colFirst="0" w:colLast="0"/>
-            <w:bookmarkEnd w:id="12"/>
-            <w:r>
-              <w:rPr>
-                <w:color w:val="999999"/>
-              </w:rPr>
-              <w:t xml:space="preserve">Can models be deployed? Which test data to assess performance? Cost/gain values for (in)correct decisions? </w:t>
-            </w:r>
-            <w:hyperlink r:id="rId11" w:anchor="fairness-constraint">
-              <w:r>
-                <w:rPr>
-                  <w:color w:val="999999"/>
-                  <w:u w:val="single"/>
-                </w:rPr>
-                <w:t>Fairness constraint</w:t>
-              </w:r>
-            </w:hyperlink>
-            <w:r>
-              <w:rPr>
-                <w:color w:val="999999"/>
-              </w:rPr>
-              <w:t>?</w:t>
-            </w:r>
-          </w:p>
-          <w:p>
-            <w:pPr>
-              <w:spacing w:after="200"/>
-              <w:jc w:val="left"/>
-              <w:rPr>
-                <w:rFonts w:ascii="Caveat" w:eastAsia="Caveat" w:hAnsi="Caveat" w:cs="Caveat"/>
-                <w:color w:val="020094"/>
-                <w:sz w:val="26"/>
-                <w:szCs w:val="26"/>
-              </w:rPr>
-            </w:pPr>
-          </w:p>
-        </w:tc>
-        <w:tc>
-          <w:tcPr>
-            <w:tcW w:w="2880" w:type="dxa"/>
-            <w:tcBorders>
-              <w:bottom w:val="single" w:sz="12" w:space="0" w:color="000000"/>
-              <w:right w:val="single" w:sz="12" w:space="0" w:color="000000"/>
-            </w:tcBorders>
-            <w:shd w:val="clear" w:color="auto" w:fill="FFFFFF"/>
-            <w:tcMar>
-              <w:top w:w="100" w:type="dxa"/>
-              <w:left w:w="100" w:type="dxa"/>
-              <w:bottom w:w="100" w:type="dxa"/>
-              <w:right w:w="100" w:type="dxa"/>
-            </w:tcMar>
-          </w:tcPr>
-          <w:p>
-            <w:pPr>
-              <w:pStyle w:val="Ttulo2"/>
-            </w:pPr>
-            <w:bookmarkStart w:id="13" w:name="_zc35ezsjbfwl" w:colFirst="0" w:colLast="0"/>
-            <w:bookmarkEnd w:id="13"/>
-            <w:r>
-              <w:rPr>
-                <w:sz w:val="20"/>
-                <w:szCs w:val="20"/>
-              </w:rPr>
-              <w:t>MAKING PREDICTIONS</w:t>
-            </w:r>
-            <w:r>
-              <w:rPr>
-                <w:noProof/>
-              </w:rPr>
-              <w:drawing>
-                <wp:anchor distT="57150" distB="57150" distL="57150" distR="57150" simplePos="0" relativeHeight="251664384" behindDoc="0" locked="0" layoutInCell="1" hidden="0" allowOverlap="1" wp14:anchorId="1460EF49" wp14:editId="1460EF4A">
-                  <wp:simplePos x="0" y="0"/>
-                  <wp:positionH relativeFrom="column">
-                    <wp:posOffset>1368000</wp:posOffset>
-                  </wp:positionH>
-                  <wp:positionV relativeFrom="paragraph">
-                    <wp:posOffset>2</wp:posOffset>
-                  </wp:positionV>
-                  <wp:extent cx="324000" cy="324000"/>
-                  <wp:effectExtent l="0" t="0" r="0" b="0"/>
-                  <wp:wrapSquare wrapText="bothSides" distT="57150" distB="57150" distL="57150" distR="57150"/>
-                  <wp:docPr id="2" name="image2.png"/>
-                  <wp:cNvGraphicFramePr/>
-                  <a:graphic xmlns:a="http://schemas.openxmlformats.org/drawingml/2006/main">
-                    <a:graphicData uri="http://schemas.openxmlformats.org/drawingml/2006/picture">
-                      <pic:pic xmlns:pic="http://schemas.openxmlformats.org/drawingml/2006/picture">
-                        <pic:nvPicPr>
-                          <pic:cNvPr id="0" name="image2.png"/>
                           <pic:cNvPicPr preferRelativeResize="0"/>
                         </pic:nvPicPr>
                         <pic:blipFill>
@@ -1493,13 +1053,13 @@
                 <w:color w:val="999999"/>
               </w:rPr>
             </w:pPr>
-            <w:bookmarkStart w:id="14" w:name="_8hc8s32ycfyi" w:colFirst="0" w:colLast="0"/>
-            <w:bookmarkEnd w:id="14"/>
+            <w:bookmarkStart w:id="9" w:name="_ft6fsaayq5ku" w:colFirst="0" w:colLast="0"/>
+            <w:bookmarkEnd w:id="9"/>
             <w:r>
               <w:rPr>
                 <w:color w:val="999999"/>
               </w:rPr>
-              <w:t>When do we make real-time / batch pred.? Time available for this + featurization + post-processing? Compute target?</w:t>
+              <w:t>Strategy for initial train set &amp; continuous update. Mention collection rate, holdout on production entities, cost/constraints to observe outcomes.</w:t>
             </w:r>
           </w:p>
           <w:p>
@@ -1507,11 +1067,8 @@
               <w:spacing w:after="200"/>
               <w:jc w:val="left"/>
               <w:rPr>
-                <w:rFonts w:ascii="Caveat" w:eastAsia="Caveat" w:hAnsi="Caveat" w:cs="Caveat"/>
-                <w:b/>
-                <w:color w:val="020094"/>
-                <w:sz w:val="26"/>
-                <w:szCs w:val="26"/>
+                <w:sz w:val="14"/>
+                <w:szCs w:val="14"/>
               </w:rPr>
             </w:pPr>
           </w:p>
@@ -1520,10 +1077,8 @@
           <w:tcPr>
             <w:tcW w:w="2880" w:type="dxa"/>
             <w:tcBorders>
-              <w:top w:val="nil"/>
-              <w:left w:val="single" w:sz="12" w:space="0" w:color="000000"/>
-              <w:bottom w:val="single" w:sz="12" w:space="0" w:color="000000"/>
-              <w:right w:val="single" w:sz="12" w:space="0" w:color="000000"/>
+              <w:top w:val="single" w:sz="24" w:space="0" w:color="000000"/>
+              <w:right w:val="single" w:sz="24" w:space="0" w:color="000000"/>
             </w:tcBorders>
             <w:shd w:val="clear" w:color="auto" w:fill="FFFFFF"/>
             <w:tcMar>
@@ -1535,59 +1090,30 @@
           </w:tcPr>
           <w:p>
             <w:pPr>
-              <w:spacing w:after="200"/>
-              <w:jc w:val="left"/>
-              <w:rPr>
-                <w:rFonts w:ascii="Caveat" w:eastAsia="Caveat" w:hAnsi="Caveat" w:cs="Caveat"/>
-                <w:b/>
-                <w:color w:val="020094"/>
-                <w:sz w:val="26"/>
-                <w:szCs w:val="26"/>
-              </w:rPr>
-            </w:pPr>
-          </w:p>
-        </w:tc>
-        <w:tc>
-          <w:tcPr>
-            <w:tcW w:w="2880" w:type="dxa"/>
-            <w:tcBorders>
-              <w:left w:val="single" w:sz="12" w:space="0" w:color="000000"/>
-              <w:bottom w:val="single" w:sz="12" w:space="0" w:color="000000"/>
-            </w:tcBorders>
-            <w:shd w:val="clear" w:color="auto" w:fill="FFFFFF"/>
-            <w:tcMar>
-              <w:top w:w="100" w:type="dxa"/>
-              <w:left w:w="100" w:type="dxa"/>
-              <w:bottom w:w="100" w:type="dxa"/>
-              <w:right w:w="100" w:type="dxa"/>
-            </w:tcMar>
-          </w:tcPr>
-          <w:p>
-            <w:pPr>
               <w:pStyle w:val="Ttulo2"/>
               <w:rPr>
                 <w:sz w:val="20"/>
                 <w:szCs w:val="20"/>
               </w:rPr>
             </w:pPr>
-            <w:bookmarkStart w:id="15" w:name="_9zshm1r41qmt" w:colFirst="0" w:colLast="0"/>
-            <w:bookmarkEnd w:id="15"/>
+            <w:bookmarkStart w:id="10" w:name="_qbxvbjfgr0il" w:colFirst="0" w:colLast="0"/>
+            <w:bookmarkEnd w:id="10"/>
             <w:r>
               <w:rPr>
                 <w:sz w:val="20"/>
                 <w:szCs w:val="20"/>
               </w:rPr>
-              <w:t>BUILDING MODELS</w:t>
+              <w:t>DATA SOURCES</w:t>
             </w:r>
             <w:r>
               <w:rPr>
                 <w:noProof/>
               </w:rPr>
               <w:drawing>
-                <wp:anchor distT="57150" distB="57150" distL="57150" distR="57150" simplePos="0" relativeHeight="251665408" behindDoc="0" locked="0" layoutInCell="1" hidden="0" allowOverlap="1" wp14:anchorId="1460EF4B" wp14:editId="1460EF4C">
+                <wp:anchor distT="57150" distB="57150" distL="57150" distR="57150" simplePos="0" relativeHeight="251662336" behindDoc="0" locked="0" layoutInCell="1" hidden="0" allowOverlap="1" wp14:anchorId="1460EF45" wp14:editId="1460EF46">
                   <wp:simplePos x="0" y="0"/>
                   <wp:positionH relativeFrom="column">
-                    <wp:posOffset>1352550</wp:posOffset>
+                    <wp:posOffset>1349999</wp:posOffset>
                   </wp:positionH>
                   <wp:positionV relativeFrom="paragraph">
                     <wp:posOffset>2</wp:posOffset>
@@ -1595,13 +1121,13 @@
                   <wp:extent cx="324000" cy="324000"/>
                   <wp:effectExtent l="0" t="0" r="0" b="0"/>
                   <wp:wrapSquare wrapText="bothSides" distT="57150" distB="57150" distL="57150" distR="57150"/>
-                  <wp:docPr id="11" name="image11.png"/>
+                  <wp:docPr id="6" name="image6.png"/>
                   <wp:cNvGraphicFramePr/>
                   <a:graphic xmlns:a="http://schemas.openxmlformats.org/drawingml/2006/main">
                     <a:graphicData uri="http://schemas.openxmlformats.org/drawingml/2006/picture">
                       <pic:pic xmlns:pic="http://schemas.openxmlformats.org/drawingml/2006/picture">
                         <pic:nvPicPr>
-                          <pic:cNvPr id="0" name="image11.png"/>
+                          <pic:cNvPr id="0" name="image6.png"/>
                           <pic:cNvPicPr preferRelativeResize="0"/>
                         </pic:nvPicPr>
                         <pic:blipFill>
@@ -1636,27 +1162,13 @@
                 <w:color w:val="999999"/>
               </w:rPr>
             </w:pPr>
-            <w:bookmarkStart w:id="16" w:name="_a5a00b2bsl02" w:colFirst="0" w:colLast="0"/>
-            <w:bookmarkEnd w:id="16"/>
+            <w:bookmarkStart w:id="11" w:name="_suo3dkmrgees" w:colFirst="0" w:colLast="0"/>
+            <w:bookmarkEnd w:id="11"/>
             <w:r>
               <w:rPr>
                 <w:color w:val="999999"/>
               </w:rPr>
-              <w:t xml:space="preserve">How many prod models are needed? When </w:t>
-            </w:r>
-            <w:proofErr w:type="gramStart"/>
-            <w:r>
-              <w:rPr>
-                <w:color w:val="999999"/>
-              </w:rPr>
-              <w:t>would</w:t>
-            </w:r>
-            <w:proofErr w:type="gramEnd"/>
-            <w:r>
-              <w:rPr>
-                <w:color w:val="999999"/>
-              </w:rPr>
-              <w:t xml:space="preserve"> we update? Time available for this (including featurization and analysis)?</w:t>
+              <w:t>Where can we get (raw) information on entities and observed outcomes? Mention database tables, API methods, websites to scrape, etc.</w:t>
             </w:r>
           </w:p>
           <w:p>
@@ -1664,20 +1176,26 @@
               <w:spacing w:after="200"/>
               <w:jc w:val="left"/>
               <w:rPr>
-                <w:rFonts w:ascii="Caveat" w:eastAsia="Caveat" w:hAnsi="Caveat" w:cs="Caveat"/>
-                <w:color w:val="020094"/>
-                <w:sz w:val="26"/>
-                <w:szCs w:val="26"/>
+                <w:i/>
+                <w:color w:val="999999"/>
+                <w:sz w:val="14"/>
+                <w:szCs w:val="14"/>
               </w:rPr>
             </w:pPr>
           </w:p>
         </w:tc>
+      </w:tr>
+      <w:tr>
+        <w:trPr>
+          <w:trHeight w:val="4215"/>
+          <w:jc w:val="center"/>
+        </w:trPr>
         <w:tc>
           <w:tcPr>
-            <w:tcW w:w="2880" w:type="dxa"/>
+            <w:tcW w:w="2955" w:type="dxa"/>
             <w:tcBorders>
+              <w:left w:val="single" w:sz="24" w:space="0" w:color="000000"/>
               <w:bottom w:val="nil"/>
-              <w:right w:val="single" w:sz="24" w:space="0" w:color="000000"/>
             </w:tcBorders>
             <w:shd w:val="clear" w:color="auto" w:fill="FFFFFF"/>
             <w:tcMar>
@@ -1695,38 +1213,39 @@
                 <w:szCs w:val="20"/>
               </w:rPr>
             </w:pPr>
-            <w:bookmarkStart w:id="17" w:name="_x6v4t7m6ilh5" w:colFirst="0" w:colLast="0"/>
-            <w:bookmarkEnd w:id="17"/>
+            <w:bookmarkStart w:id="12" w:name="_gavc6auq90os" w:colFirst="0" w:colLast="0"/>
+            <w:bookmarkEnd w:id="12"/>
             <w:r>
               <w:rPr>
                 <w:sz w:val="20"/>
                 <w:szCs w:val="20"/>
               </w:rPr>
-              <w:t>FEATURES</w:t>
+              <w:lastRenderedPageBreak/>
+              <w:t>IMPACT SIMULATION</w:t>
             </w:r>
             <w:r>
               <w:rPr>
                 <w:noProof/>
               </w:rPr>
               <w:drawing>
-                <wp:anchor distT="114300" distB="114300" distL="114300" distR="114300" simplePos="0" relativeHeight="251666432" behindDoc="0" locked="0" layoutInCell="1" hidden="0" allowOverlap="1" wp14:anchorId="1460EF4D" wp14:editId="1460EF4E">
+                <wp:anchor distT="57150" distB="57150" distL="57150" distR="57150" simplePos="0" relativeHeight="251663360" behindDoc="0" locked="0" layoutInCell="1" hidden="0" allowOverlap="1" wp14:anchorId="1460EF47" wp14:editId="1460EF48">
                   <wp:simplePos x="0" y="0"/>
                   <wp:positionH relativeFrom="column">
-                    <wp:posOffset>1349999</wp:posOffset>
+                    <wp:posOffset>1385999</wp:posOffset>
                   </wp:positionH>
                   <wp:positionV relativeFrom="paragraph">
                     <wp:posOffset>2</wp:posOffset>
                   </wp:positionV>
                   <wp:extent cx="324000" cy="324000"/>
                   <wp:effectExtent l="0" t="0" r="0" b="0"/>
-                  <wp:wrapSquare wrapText="bothSides" distT="114300" distB="114300" distL="114300" distR="114300"/>
-                  <wp:docPr id="3" name="image3.png"/>
+                  <wp:wrapSquare wrapText="bothSides" distT="57150" distB="57150" distL="57150" distR="57150"/>
+                  <wp:docPr id="1" name="image1.png"/>
                   <wp:cNvGraphicFramePr/>
                   <a:graphic xmlns:a="http://schemas.openxmlformats.org/drawingml/2006/main">
                     <a:graphicData uri="http://schemas.openxmlformats.org/drawingml/2006/picture">
                       <pic:pic xmlns:pic="http://schemas.openxmlformats.org/drawingml/2006/picture">
                         <pic:nvPicPr>
-                          <pic:cNvPr id="0" name="image3.png"/>
+                          <pic:cNvPr id="0" name="image1.png"/>
                           <pic:cNvPicPr preferRelativeResize="0"/>
                         </pic:nvPicPr>
                         <pic:blipFill>
@@ -1758,6 +1277,382 @@
               <w:pStyle w:val="Ttulo3"/>
               <w:spacing w:after="200"/>
               <w:rPr>
+                <w:color w:val="999999"/>
+              </w:rPr>
+            </w:pPr>
+            <w:bookmarkStart w:id="13" w:name="_p0v095vyqr5l" w:colFirst="0" w:colLast="0"/>
+            <w:bookmarkEnd w:id="13"/>
+            <w:r>
+              <w:rPr>
+                <w:color w:val="999999"/>
+              </w:rPr>
+              <w:t xml:space="preserve">Can models be deployed? Which test data to assess performance? Cost/gain values for (in)correct decisions? </w:t>
+            </w:r>
+            <w:hyperlink r:id="rId15" w:anchor="fairness-constraint">
+              <w:r>
+                <w:rPr>
+                  <w:color w:val="999999"/>
+                  <w:u w:val="single"/>
+                </w:rPr>
+                <w:t>Fairness constraint</w:t>
+              </w:r>
+            </w:hyperlink>
+            <w:r>
+              <w:rPr>
+                <w:color w:val="999999"/>
+              </w:rPr>
+              <w:t>?</w:t>
+            </w:r>
+          </w:p>
+          <w:p>
+            <w:pPr>
+              <w:spacing w:after="200"/>
+              <w:jc w:val="left"/>
+              <w:rPr>
+                <w:rFonts w:ascii="Caveat" w:eastAsia="Caveat" w:hAnsi="Caveat" w:cs="Caveat"/>
+                <w:color w:val="020094"/>
+                <w:sz w:val="26"/>
+                <w:szCs w:val="26"/>
+              </w:rPr>
+            </w:pPr>
+          </w:p>
+        </w:tc>
+        <w:tc>
+          <w:tcPr>
+            <w:tcW w:w="2880" w:type="dxa"/>
+            <w:tcBorders>
+              <w:bottom w:val="single" w:sz="12" w:space="0" w:color="000000"/>
+              <w:right w:val="single" w:sz="12" w:space="0" w:color="000000"/>
+            </w:tcBorders>
+            <w:shd w:val="clear" w:color="auto" w:fill="FFFFFF"/>
+            <w:tcMar>
+              <w:top w:w="100" w:type="dxa"/>
+              <w:left w:w="100" w:type="dxa"/>
+              <w:bottom w:w="100" w:type="dxa"/>
+              <w:right w:w="100" w:type="dxa"/>
+            </w:tcMar>
+          </w:tcPr>
+          <w:p>
+            <w:pPr>
+              <w:pStyle w:val="Ttulo2"/>
+            </w:pPr>
+            <w:bookmarkStart w:id="14" w:name="_zc35ezsjbfwl" w:colFirst="0" w:colLast="0"/>
+            <w:bookmarkEnd w:id="14"/>
+            <w:r>
+              <w:rPr>
+                <w:sz w:val="20"/>
+                <w:szCs w:val="20"/>
+              </w:rPr>
+              <w:t>MAKING PREDICTIONS</w:t>
+            </w:r>
+            <w:r>
+              <w:rPr>
+                <w:noProof/>
+              </w:rPr>
+              <w:drawing>
+                <wp:anchor distT="57150" distB="57150" distL="57150" distR="57150" simplePos="0" relativeHeight="251664384" behindDoc="0" locked="0" layoutInCell="1" hidden="0" allowOverlap="1" wp14:anchorId="1460EF49" wp14:editId="1460EF4A">
+                  <wp:simplePos x="0" y="0"/>
+                  <wp:positionH relativeFrom="column">
+                    <wp:posOffset>1368000</wp:posOffset>
+                  </wp:positionH>
+                  <wp:positionV relativeFrom="paragraph">
+                    <wp:posOffset>2</wp:posOffset>
+                  </wp:positionV>
+                  <wp:extent cx="324000" cy="324000"/>
+                  <wp:effectExtent l="0" t="0" r="0" b="0"/>
+                  <wp:wrapSquare wrapText="bothSides" distT="57150" distB="57150" distL="57150" distR="57150"/>
+                  <wp:docPr id="2" name="image2.png"/>
+                  <wp:cNvGraphicFramePr/>
+                  <a:graphic xmlns:a="http://schemas.openxmlformats.org/drawingml/2006/main">
+                    <a:graphicData uri="http://schemas.openxmlformats.org/drawingml/2006/picture">
+                      <pic:pic xmlns:pic="http://schemas.openxmlformats.org/drawingml/2006/picture">
+                        <pic:nvPicPr>
+                          <pic:cNvPr id="0" name="image2.png"/>
+                          <pic:cNvPicPr preferRelativeResize="0"/>
+                        </pic:nvPicPr>
+                        <pic:blipFill>
+                          <a:blip r:embed="rId16"/>
+                          <a:srcRect/>
+                          <a:stretch>
+                            <a:fillRect/>
+                          </a:stretch>
+                        </pic:blipFill>
+                        <pic:spPr>
+                          <a:xfrm>
+                            <a:off x="0" y="0"/>
+                            <a:ext cx="324000" cy="324000"/>
+                          </a:xfrm>
+                          <a:prstGeom prst="rect">
+                            <a:avLst/>
+                          </a:prstGeom>
+                          <a:ln/>
+                        </pic:spPr>
+                      </pic:pic>
+                    </a:graphicData>
+                  </a:graphic>
+                </wp:anchor>
+              </w:drawing>
+            </w:r>
+          </w:p>
+          <w:p>
+            <w:pPr>
+              <w:pStyle w:val="Ttulo3"/>
+              <w:spacing w:after="200"/>
+              <w:rPr>
+                <w:color w:val="999999"/>
+              </w:rPr>
+            </w:pPr>
+            <w:bookmarkStart w:id="15" w:name="_8hc8s32ycfyi" w:colFirst="0" w:colLast="0"/>
+            <w:bookmarkEnd w:id="15"/>
+            <w:r>
+              <w:rPr>
+                <w:color w:val="999999"/>
+              </w:rPr>
+              <w:t>When do we make real-time / batch pred.? Time available for this + featurization + post-processing? Compute target?</w:t>
+            </w:r>
+          </w:p>
+          <w:p>
+            <w:pPr>
+              <w:spacing w:after="200"/>
+              <w:jc w:val="left"/>
+              <w:rPr>
+                <w:rFonts w:ascii="Caveat" w:eastAsia="Caveat" w:hAnsi="Caveat" w:cs="Caveat"/>
+                <w:b/>
+                <w:color w:val="020094"/>
+                <w:sz w:val="26"/>
+                <w:szCs w:val="26"/>
+              </w:rPr>
+            </w:pPr>
+          </w:p>
+        </w:tc>
+        <w:tc>
+          <w:tcPr>
+            <w:tcW w:w="2880" w:type="dxa"/>
+            <w:tcBorders>
+              <w:top w:val="nil"/>
+              <w:left w:val="single" w:sz="12" w:space="0" w:color="000000"/>
+              <w:bottom w:val="single" w:sz="12" w:space="0" w:color="000000"/>
+              <w:right w:val="single" w:sz="12" w:space="0" w:color="000000"/>
+            </w:tcBorders>
+            <w:shd w:val="clear" w:color="auto" w:fill="FFFFFF"/>
+            <w:tcMar>
+              <w:top w:w="100" w:type="dxa"/>
+              <w:left w:w="100" w:type="dxa"/>
+              <w:bottom w:w="100" w:type="dxa"/>
+              <w:right w:w="100" w:type="dxa"/>
+            </w:tcMar>
+          </w:tcPr>
+          <w:p>
+            <w:pPr>
+              <w:spacing w:after="200"/>
+              <w:jc w:val="left"/>
+              <w:rPr>
+                <w:rFonts w:ascii="Caveat" w:eastAsia="Caveat" w:hAnsi="Caveat" w:cs="Caveat"/>
+                <w:b/>
+                <w:color w:val="020094"/>
+                <w:sz w:val="26"/>
+                <w:szCs w:val="26"/>
+              </w:rPr>
+            </w:pPr>
+          </w:p>
+        </w:tc>
+        <w:tc>
+          <w:tcPr>
+            <w:tcW w:w="2880" w:type="dxa"/>
+            <w:tcBorders>
+              <w:left w:val="single" w:sz="12" w:space="0" w:color="000000"/>
+              <w:bottom w:val="single" w:sz="12" w:space="0" w:color="000000"/>
+            </w:tcBorders>
+            <w:shd w:val="clear" w:color="auto" w:fill="FFFFFF"/>
+            <w:tcMar>
+              <w:top w:w="100" w:type="dxa"/>
+              <w:left w:w="100" w:type="dxa"/>
+              <w:bottom w:w="100" w:type="dxa"/>
+              <w:right w:w="100" w:type="dxa"/>
+            </w:tcMar>
+          </w:tcPr>
+          <w:p>
+            <w:pPr>
+              <w:pStyle w:val="Ttulo2"/>
+              <w:rPr>
+                <w:sz w:val="20"/>
+                <w:szCs w:val="20"/>
+              </w:rPr>
+            </w:pPr>
+            <w:bookmarkStart w:id="16" w:name="_9zshm1r41qmt" w:colFirst="0" w:colLast="0"/>
+            <w:bookmarkEnd w:id="16"/>
+            <w:r>
+              <w:rPr>
+                <w:sz w:val="20"/>
+                <w:szCs w:val="20"/>
+              </w:rPr>
+              <w:t>BUILDING MODELS</w:t>
+            </w:r>
+            <w:r>
+              <w:rPr>
+                <w:noProof/>
+              </w:rPr>
+              <w:drawing>
+                <wp:anchor distT="57150" distB="57150" distL="57150" distR="57150" simplePos="0" relativeHeight="251665408" behindDoc="0" locked="0" layoutInCell="1" hidden="0" allowOverlap="1" wp14:anchorId="1460EF4B" wp14:editId="1460EF4C">
+                  <wp:simplePos x="0" y="0"/>
+                  <wp:positionH relativeFrom="column">
+                    <wp:posOffset>1352550</wp:posOffset>
+                  </wp:positionH>
+                  <wp:positionV relativeFrom="paragraph">
+                    <wp:posOffset>2</wp:posOffset>
+                  </wp:positionV>
+                  <wp:extent cx="324000" cy="324000"/>
+                  <wp:effectExtent l="0" t="0" r="0" b="0"/>
+                  <wp:wrapSquare wrapText="bothSides" distT="57150" distB="57150" distL="57150" distR="57150"/>
+                  <wp:docPr id="11" name="image11.png"/>
+                  <wp:cNvGraphicFramePr/>
+                  <a:graphic xmlns:a="http://schemas.openxmlformats.org/drawingml/2006/main">
+                    <a:graphicData uri="http://schemas.openxmlformats.org/drawingml/2006/picture">
+                      <pic:pic xmlns:pic="http://schemas.openxmlformats.org/drawingml/2006/picture">
+                        <pic:nvPicPr>
+                          <pic:cNvPr id="0" name="image11.png"/>
+                          <pic:cNvPicPr preferRelativeResize="0"/>
+                        </pic:nvPicPr>
+                        <pic:blipFill>
+                          <a:blip r:embed="rId17"/>
+                          <a:srcRect/>
+                          <a:stretch>
+                            <a:fillRect/>
+                          </a:stretch>
+                        </pic:blipFill>
+                        <pic:spPr>
+                          <a:xfrm>
+                            <a:off x="0" y="0"/>
+                            <a:ext cx="324000" cy="324000"/>
+                          </a:xfrm>
+                          <a:prstGeom prst="rect">
+                            <a:avLst/>
+                          </a:prstGeom>
+                          <a:ln/>
+                        </pic:spPr>
+                      </pic:pic>
+                    </a:graphicData>
+                  </a:graphic>
+                </wp:anchor>
+              </w:drawing>
+            </w:r>
+          </w:p>
+          <w:p>
+            <w:pPr>
+              <w:pStyle w:val="Ttulo3"/>
+              <w:spacing w:after="200"/>
+              <w:rPr>
+                <w:color w:val="999999"/>
+              </w:rPr>
+            </w:pPr>
+            <w:bookmarkStart w:id="17" w:name="_a5a00b2bsl02" w:colFirst="0" w:colLast="0"/>
+            <w:bookmarkEnd w:id="17"/>
+            <w:r>
+              <w:rPr>
+                <w:color w:val="999999"/>
+              </w:rPr>
+              <w:t>How many prod models are needed? When would we update? Time available for this (including featurization and analysis)?</w:t>
+            </w:r>
+          </w:p>
+          <w:p>
+            <w:pPr>
+              <w:spacing w:after="200"/>
+              <w:jc w:val="left"/>
+              <w:rPr>
+                <w:rFonts w:ascii="Caveat" w:eastAsia="Caveat" w:hAnsi="Caveat" w:cs="Caveat"/>
+                <w:color w:val="020094"/>
+                <w:sz w:val="26"/>
+                <w:szCs w:val="26"/>
+              </w:rPr>
+            </w:pPr>
+          </w:p>
+        </w:tc>
+        <w:tc>
+          <w:tcPr>
+            <w:tcW w:w="2880" w:type="dxa"/>
+            <w:tcBorders>
+              <w:bottom w:val="nil"/>
+              <w:right w:val="single" w:sz="24" w:space="0" w:color="000000"/>
+            </w:tcBorders>
+            <w:shd w:val="clear" w:color="auto" w:fill="FFFFFF"/>
+            <w:tcMar>
+              <w:top w:w="100" w:type="dxa"/>
+              <w:left w:w="100" w:type="dxa"/>
+              <w:bottom w:w="100" w:type="dxa"/>
+              <w:right w:w="100" w:type="dxa"/>
+            </w:tcMar>
+          </w:tcPr>
+          <w:p>
+            <w:pPr>
+              <w:pStyle w:val="Ttulo2"/>
+              <w:rPr>
+                <w:sz w:val="20"/>
+                <w:szCs w:val="20"/>
+              </w:rPr>
+            </w:pPr>
+            <w:bookmarkStart w:id="18" w:name="_x6v4t7m6ilh5" w:colFirst="0" w:colLast="0"/>
+            <w:bookmarkEnd w:id="18"/>
+            <w:r>
+              <w:rPr>
+                <w:sz w:val="20"/>
+                <w:szCs w:val="20"/>
+              </w:rPr>
+              <w:t>FEATURES</w:t>
+            </w:r>
+            <w:r>
+              <w:rPr>
+                <w:noProof/>
+              </w:rPr>
+              <w:drawing>
+                <wp:anchor distT="114300" distB="114300" distL="114300" distR="114300" simplePos="0" relativeHeight="251666432" behindDoc="0" locked="0" layoutInCell="1" hidden="0" allowOverlap="1" wp14:anchorId="1460EF4D" wp14:editId="1460EF4E">
+                  <wp:simplePos x="0" y="0"/>
+                  <wp:positionH relativeFrom="column">
+                    <wp:posOffset>1349999</wp:posOffset>
+                  </wp:positionH>
+                  <wp:positionV relativeFrom="paragraph">
+                    <wp:posOffset>2</wp:posOffset>
+                  </wp:positionV>
+                  <wp:extent cx="324000" cy="324000"/>
+                  <wp:effectExtent l="0" t="0" r="0" b="0"/>
+                  <wp:wrapSquare wrapText="bothSides" distT="114300" distB="114300" distL="114300" distR="114300"/>
+                  <wp:docPr id="3" name="image3.png"/>
+                  <wp:cNvGraphicFramePr/>
+                  <a:graphic xmlns:a="http://schemas.openxmlformats.org/drawingml/2006/main">
+                    <a:graphicData uri="http://schemas.openxmlformats.org/drawingml/2006/picture">
+                      <pic:pic xmlns:pic="http://schemas.openxmlformats.org/drawingml/2006/picture">
+                        <pic:nvPicPr>
+                          <pic:cNvPr id="0" name="image3.png"/>
+                          <pic:cNvPicPr preferRelativeResize="0"/>
+                        </pic:nvPicPr>
+                        <pic:blipFill>
+                          <a:blip r:embed="rId18"/>
+                          <a:srcRect/>
+                          <a:stretch>
+                            <a:fillRect/>
+                          </a:stretch>
+                        </pic:blipFill>
+                        <pic:spPr>
+                          <a:xfrm>
+                            <a:off x="0" y="0"/>
+                            <a:ext cx="324000" cy="324000"/>
+                          </a:xfrm>
+                          <a:prstGeom prst="rect">
+                            <a:avLst/>
+                          </a:prstGeom>
+                          <a:ln/>
+                        </pic:spPr>
+                      </pic:pic>
+                    </a:graphicData>
+                  </a:graphic>
+                </wp:anchor>
+              </w:drawing>
+            </w:r>
+          </w:p>
+          <w:p>
+            <w:pPr>
+              <w:pStyle w:val="Ttulo3"/>
+              <w:spacing w:after="200"/>
+              <w:rPr>
                 <w:rFonts w:ascii="Caveat" w:eastAsia="Caveat" w:hAnsi="Caveat" w:cs="Caveat"/>
                 <w:b/>
                 <w:color w:val="020094"/>
@@ -1765,8 +1660,8 @@
                 <w:szCs w:val="28"/>
               </w:rPr>
             </w:pPr>
-            <w:bookmarkStart w:id="18" w:name="_a601mq5f3u9z" w:colFirst="0" w:colLast="0"/>
-            <w:bookmarkEnd w:id="18"/>
+            <w:bookmarkStart w:id="19" w:name="_a601mq5f3u9z" w:colFirst="0" w:colLast="0"/>
+            <w:bookmarkEnd w:id="19"/>
             <w:r>
               <w:rPr>
                 <w:color w:val="999999"/>
@@ -1841,8 +1736,8 @@
                 <w:szCs w:val="20"/>
               </w:rPr>
             </w:pPr>
-            <w:bookmarkStart w:id="19" w:name="_qmr0pxc8xmm5" w:colFirst="0" w:colLast="0"/>
-            <w:bookmarkEnd w:id="19"/>
+            <w:bookmarkStart w:id="20" w:name="_qmr0pxc8xmm5" w:colFirst="0" w:colLast="0"/>
+            <w:bookmarkEnd w:id="20"/>
             <w:r>
               <w:rPr>
                 <w:sz w:val="20"/>
@@ -1859,8 +1754,8 @@
                 <w:color w:val="999999"/>
               </w:rPr>
             </w:pPr>
-            <w:bookmarkStart w:id="20" w:name="_w1wa5ld9rmzp" w:colFirst="0" w:colLast="0"/>
-            <w:bookmarkEnd w:id="20"/>
+            <w:bookmarkStart w:id="21" w:name="_w1wa5ld9rmzp" w:colFirst="0" w:colLast="0"/>
+            <w:bookmarkEnd w:id="21"/>
             <w:r>
               <w:rPr>
                 <w:color w:val="999999"/>
@@ -1953,7 +1848,7 @@
                           <pic:cNvPicPr preferRelativeResize="0"/>
                         </pic:nvPicPr>
                         <pic:blipFill>
-                          <a:blip r:embed="rId15"/>
+                          <a:blip r:embed="rId19"/>
                           <a:srcRect/>
                           <a:stretch>
                             <a:fillRect/>
@@ -2077,166 +1972,6 @@
                           <pic:cNvPicPr preferRelativeResize="0"/>
                         </pic:nvPicPr>
                         <pic:blipFill>
-                          <a:blip r:embed="rId16"/>
-                          <a:srcRect/>
-                          <a:stretch>
-                            <a:fillRect/>
-                          </a:stretch>
-                        </pic:blipFill>
-                        <pic:spPr>
-                          <a:xfrm>
-                            <a:off x="0" y="0"/>
-                            <a:ext cx="190500" cy="190500"/>
-                          </a:xfrm>
-                          <a:prstGeom prst="rect">
-                            <a:avLst/>
-                          </a:prstGeom>
-                          <a:ln/>
-                        </pic:spPr>
-                      </pic:pic>
-                    </a:graphicData>
-                  </a:graphic>
-                </wp:inline>
-              </w:drawing>
-            </w:r>
-            <w:r>
-              <w:rPr>
-                <w:noProof/>
-              </w:rPr>
-              <w:drawing>
-                <wp:inline distT="114300" distB="114300" distL="114300" distR="114300" wp14:anchorId="1460EF53" wp14:editId="1460EF54">
-                  <wp:extent cx="190500" cy="190500"/>
-                  <wp:effectExtent l="0" t="0" r="0" b="0"/>
-                  <wp:docPr id="8" name="image8.png"/>
-                  <wp:cNvGraphicFramePr/>
-                  <a:graphic xmlns:a="http://schemas.openxmlformats.org/drawingml/2006/main">
-                    <a:graphicData uri="http://schemas.openxmlformats.org/drawingml/2006/picture">
-                      <pic:pic xmlns:pic="http://schemas.openxmlformats.org/drawingml/2006/picture">
-                        <pic:nvPicPr>
-                          <pic:cNvPr id="0" name="image8.png"/>
-                          <pic:cNvPicPr preferRelativeResize="0"/>
-                        </pic:nvPicPr>
-                        <pic:blipFill>
-                          <a:blip r:embed="rId17"/>
-                          <a:srcRect/>
-                          <a:stretch>
-                            <a:fillRect/>
-                          </a:stretch>
-                        </pic:blipFill>
-                        <pic:spPr>
-                          <a:xfrm>
-                            <a:off x="0" y="0"/>
-                            <a:ext cx="190500" cy="190500"/>
-                          </a:xfrm>
-                          <a:prstGeom prst="rect">
-                            <a:avLst/>
-                          </a:prstGeom>
-                          <a:ln/>
-                        </pic:spPr>
-                      </pic:pic>
-                    </a:graphicData>
-                  </a:graphic>
-                </wp:inline>
-              </w:drawing>
-            </w:r>
-            <w:r>
-              <w:rPr>
-                <w:noProof/>
-              </w:rPr>
-              <w:drawing>
-                <wp:inline distT="114300" distB="114300" distL="114300" distR="114300" wp14:anchorId="1460EF55" wp14:editId="1460EF56">
-                  <wp:extent cx="190500" cy="190500"/>
-                  <wp:effectExtent l="0" t="0" r="0" b="0"/>
-                  <wp:docPr id="10" name="image10.png"/>
-                  <wp:cNvGraphicFramePr/>
-                  <a:graphic xmlns:a="http://schemas.openxmlformats.org/drawingml/2006/main">
-                    <a:graphicData uri="http://schemas.openxmlformats.org/drawingml/2006/picture">
-                      <pic:pic xmlns:pic="http://schemas.openxmlformats.org/drawingml/2006/picture">
-                        <pic:nvPicPr>
-                          <pic:cNvPr id="0" name="image10.png"/>
-                          <pic:cNvPicPr preferRelativeResize="0"/>
-                        </pic:nvPicPr>
-                        <pic:blipFill>
-                          <a:blip r:embed="rId18"/>
-                          <a:srcRect/>
-                          <a:stretch>
-                            <a:fillRect/>
-                          </a:stretch>
-                        </pic:blipFill>
-                        <pic:spPr>
-                          <a:xfrm>
-                            <a:off x="0" y="0"/>
-                            <a:ext cx="190500" cy="190500"/>
-                          </a:xfrm>
-                          <a:prstGeom prst="rect">
-                            <a:avLst/>
-                          </a:prstGeom>
-                          <a:ln/>
-                        </pic:spPr>
-                      </pic:pic>
-                    </a:graphicData>
-                  </a:graphic>
-                </wp:inline>
-              </w:drawing>
-            </w:r>
-            <w:r>
-              <w:rPr>
-                <w:noProof/>
-              </w:rPr>
-              <w:drawing>
-                <wp:inline distT="114300" distB="114300" distL="114300" distR="114300" wp14:anchorId="1460EF57" wp14:editId="1460EF58">
-                  <wp:extent cx="190500" cy="190500"/>
-                  <wp:effectExtent l="0" t="0" r="0" b="0"/>
-                  <wp:docPr id="12" name="image12.png"/>
-                  <wp:cNvGraphicFramePr/>
-                  <a:graphic xmlns:a="http://schemas.openxmlformats.org/drawingml/2006/main">
-                    <a:graphicData uri="http://schemas.openxmlformats.org/drawingml/2006/picture">
-                      <pic:pic xmlns:pic="http://schemas.openxmlformats.org/drawingml/2006/picture">
-                        <pic:nvPicPr>
-                          <pic:cNvPr id="0" name="image12.png"/>
-                          <pic:cNvPicPr preferRelativeResize="0"/>
-                        </pic:nvPicPr>
-                        <pic:blipFill>
-                          <a:blip r:embed="rId19"/>
-                          <a:srcRect/>
-                          <a:stretch>
-                            <a:fillRect/>
-                          </a:stretch>
-                        </pic:blipFill>
-                        <pic:spPr>
-                          <a:xfrm>
-                            <a:off x="0" y="0"/>
-                            <a:ext cx="190500" cy="190500"/>
-                          </a:xfrm>
-                          <a:prstGeom prst="rect">
-                            <a:avLst/>
-                          </a:prstGeom>
-                          <a:ln/>
-                        </pic:spPr>
-                      </pic:pic>
-                    </a:graphicData>
-                  </a:graphic>
-                </wp:inline>
-              </w:drawing>
-            </w:r>
-            <w:r>
-              <w:rPr>
-                <w:noProof/>
-              </w:rPr>
-              <w:drawing>
-                <wp:inline distT="114300" distB="114300" distL="114300" distR="114300" wp14:anchorId="1460EF59" wp14:editId="1460EF5A">
-                  <wp:extent cx="190500" cy="190500"/>
-                  <wp:effectExtent l="0" t="0" r="0" b="0"/>
-                  <wp:docPr id="13" name="image13.png"/>
-                  <wp:cNvGraphicFramePr/>
-                  <a:graphic xmlns:a="http://schemas.openxmlformats.org/drawingml/2006/main">
-                    <a:graphicData uri="http://schemas.openxmlformats.org/drawingml/2006/picture">
-                      <pic:pic xmlns:pic="http://schemas.openxmlformats.org/drawingml/2006/picture">
-                        <pic:nvPicPr>
-                          <pic:cNvPr id="0" name="image13.png"/>
-                          <pic:cNvPicPr preferRelativeResize="0"/>
-                        </pic:nvPicPr>
-                        <pic:blipFill>
                           <a:blip r:embed="rId20"/>
                           <a:srcRect/>
                           <a:stretch>
@@ -2259,6 +1994,166 @@
                 </wp:inline>
               </w:drawing>
             </w:r>
+            <w:r>
+              <w:rPr>
+                <w:noProof/>
+              </w:rPr>
+              <w:drawing>
+                <wp:inline distT="114300" distB="114300" distL="114300" distR="114300" wp14:anchorId="1460EF53" wp14:editId="1460EF54">
+                  <wp:extent cx="190500" cy="190500"/>
+                  <wp:effectExtent l="0" t="0" r="0" b="0"/>
+                  <wp:docPr id="8" name="image8.png"/>
+                  <wp:cNvGraphicFramePr/>
+                  <a:graphic xmlns:a="http://schemas.openxmlformats.org/drawingml/2006/main">
+                    <a:graphicData uri="http://schemas.openxmlformats.org/drawingml/2006/picture">
+                      <pic:pic xmlns:pic="http://schemas.openxmlformats.org/drawingml/2006/picture">
+                        <pic:nvPicPr>
+                          <pic:cNvPr id="0" name="image8.png"/>
+                          <pic:cNvPicPr preferRelativeResize="0"/>
+                        </pic:nvPicPr>
+                        <pic:blipFill>
+                          <a:blip r:embed="rId21"/>
+                          <a:srcRect/>
+                          <a:stretch>
+                            <a:fillRect/>
+                          </a:stretch>
+                        </pic:blipFill>
+                        <pic:spPr>
+                          <a:xfrm>
+                            <a:off x="0" y="0"/>
+                            <a:ext cx="190500" cy="190500"/>
+                          </a:xfrm>
+                          <a:prstGeom prst="rect">
+                            <a:avLst/>
+                          </a:prstGeom>
+                          <a:ln/>
+                        </pic:spPr>
+                      </pic:pic>
+                    </a:graphicData>
+                  </a:graphic>
+                </wp:inline>
+              </w:drawing>
+            </w:r>
+            <w:r>
+              <w:rPr>
+                <w:noProof/>
+              </w:rPr>
+              <w:drawing>
+                <wp:inline distT="114300" distB="114300" distL="114300" distR="114300" wp14:anchorId="1460EF55" wp14:editId="1460EF56">
+                  <wp:extent cx="190500" cy="190500"/>
+                  <wp:effectExtent l="0" t="0" r="0" b="0"/>
+                  <wp:docPr id="10" name="image10.png"/>
+                  <wp:cNvGraphicFramePr/>
+                  <a:graphic xmlns:a="http://schemas.openxmlformats.org/drawingml/2006/main">
+                    <a:graphicData uri="http://schemas.openxmlformats.org/drawingml/2006/picture">
+                      <pic:pic xmlns:pic="http://schemas.openxmlformats.org/drawingml/2006/picture">
+                        <pic:nvPicPr>
+                          <pic:cNvPr id="0" name="image10.png"/>
+                          <pic:cNvPicPr preferRelativeResize="0"/>
+                        </pic:nvPicPr>
+                        <pic:blipFill>
+                          <a:blip r:embed="rId22"/>
+                          <a:srcRect/>
+                          <a:stretch>
+                            <a:fillRect/>
+                          </a:stretch>
+                        </pic:blipFill>
+                        <pic:spPr>
+                          <a:xfrm>
+                            <a:off x="0" y="0"/>
+                            <a:ext cx="190500" cy="190500"/>
+                          </a:xfrm>
+                          <a:prstGeom prst="rect">
+                            <a:avLst/>
+                          </a:prstGeom>
+                          <a:ln/>
+                        </pic:spPr>
+                      </pic:pic>
+                    </a:graphicData>
+                  </a:graphic>
+                </wp:inline>
+              </w:drawing>
+            </w:r>
+            <w:r>
+              <w:rPr>
+                <w:noProof/>
+              </w:rPr>
+              <w:drawing>
+                <wp:inline distT="114300" distB="114300" distL="114300" distR="114300" wp14:anchorId="1460EF57" wp14:editId="1460EF58">
+                  <wp:extent cx="190500" cy="190500"/>
+                  <wp:effectExtent l="0" t="0" r="0" b="0"/>
+                  <wp:docPr id="12" name="image12.png"/>
+                  <wp:cNvGraphicFramePr/>
+                  <a:graphic xmlns:a="http://schemas.openxmlformats.org/drawingml/2006/main">
+                    <a:graphicData uri="http://schemas.openxmlformats.org/drawingml/2006/picture">
+                      <pic:pic xmlns:pic="http://schemas.openxmlformats.org/drawingml/2006/picture">
+                        <pic:nvPicPr>
+                          <pic:cNvPr id="0" name="image12.png"/>
+                          <pic:cNvPicPr preferRelativeResize="0"/>
+                        </pic:nvPicPr>
+                        <pic:blipFill>
+                          <a:blip r:embed="rId23"/>
+                          <a:srcRect/>
+                          <a:stretch>
+                            <a:fillRect/>
+                          </a:stretch>
+                        </pic:blipFill>
+                        <pic:spPr>
+                          <a:xfrm>
+                            <a:off x="0" y="0"/>
+                            <a:ext cx="190500" cy="190500"/>
+                          </a:xfrm>
+                          <a:prstGeom prst="rect">
+                            <a:avLst/>
+                          </a:prstGeom>
+                          <a:ln/>
+                        </pic:spPr>
+                      </pic:pic>
+                    </a:graphicData>
+                  </a:graphic>
+                </wp:inline>
+              </w:drawing>
+            </w:r>
+            <w:r>
+              <w:rPr>
+                <w:noProof/>
+              </w:rPr>
+              <w:drawing>
+                <wp:inline distT="114300" distB="114300" distL="114300" distR="114300" wp14:anchorId="1460EF59" wp14:editId="1460EF5A">
+                  <wp:extent cx="190500" cy="190500"/>
+                  <wp:effectExtent l="0" t="0" r="0" b="0"/>
+                  <wp:docPr id="13" name="image13.png"/>
+                  <wp:cNvGraphicFramePr/>
+                  <a:graphic xmlns:a="http://schemas.openxmlformats.org/drawingml/2006/main">
+                    <a:graphicData uri="http://schemas.openxmlformats.org/drawingml/2006/picture">
+                      <pic:pic xmlns:pic="http://schemas.openxmlformats.org/drawingml/2006/picture">
+                        <pic:nvPicPr>
+                          <pic:cNvPr id="0" name="image13.png"/>
+                          <pic:cNvPicPr preferRelativeResize="0"/>
+                        </pic:nvPicPr>
+                        <pic:blipFill>
+                          <a:blip r:embed="rId24"/>
+                          <a:srcRect/>
+                          <a:stretch>
+                            <a:fillRect/>
+                          </a:stretch>
+                        </pic:blipFill>
+                        <pic:spPr>
+                          <a:xfrm>
+                            <a:off x="0" y="0"/>
+                            <a:ext cx="190500" cy="190500"/>
+                          </a:xfrm>
+                          <a:prstGeom prst="rect">
+                            <a:avLst/>
+                          </a:prstGeom>
+                          <a:ln/>
+                        </pic:spPr>
+                      </pic:pic>
+                    </a:graphicData>
+                  </a:graphic>
+                </wp:inline>
+              </w:drawing>
+            </w:r>
           </w:p>
         </w:tc>
         <w:tc>
@@ -2285,26 +2180,12 @@
             <w:r>
               <w:t xml:space="preserve">Version 1.1. Created by Louis Dorard, Ph.D. Licensed under a </w:t>
             </w:r>
-            <w:hyperlink r:id="rId21">
+            <w:hyperlink r:id="rId25">
               <w:r>
                 <w:rPr>
                   <w:u w:val="single"/>
                 </w:rPr>
-                <w:t>Creative Commons Attribution-</w:t>
-              </w:r>
-              <w:proofErr w:type="spellStart"/>
-              <w:r>
-                <w:rPr>
-                  <w:u w:val="single"/>
-                </w:rPr>
-                <w:t>ShareAlike</w:t>
-              </w:r>
-              <w:proofErr w:type="spellEnd"/>
-              <w:r>
-                <w:rPr>
-                  <w:u w:val="single"/>
-                </w:rPr>
-                <w:t xml:space="preserve"> 4.0 International License</w:t>
+                <w:t>Creative Commons Attribution-ShareAlike 4.0 International License</w:t>
               </w:r>
             </w:hyperlink>
             <w:r>
@@ -2314,7 +2195,7 @@
               <w:br/>
               <w:t xml:space="preserve">Please keep this mention and the link to </w:t>
             </w:r>
-            <w:hyperlink r:id="rId22">
+            <w:hyperlink r:id="rId26">
               <w:r>
                 <w:rPr>
                   <w:u w:val="single"/>
@@ -2351,7 +2232,7 @@
             <w:r>
               <w:t xml:space="preserve"> </w:t>
             </w:r>
-            <w:hyperlink r:id="rId23">
+            <w:hyperlink r:id="rId27">
               <w:r>
                 <w:rPr>
                   <w:b/>
@@ -2371,8 +2252,8 @@
       <w:pPr>
         <w:pStyle w:val="Ttulo1"/>
       </w:pPr>
-      <w:bookmarkStart w:id="21" w:name="_wulbjywgoa5v" w:colFirst="0" w:colLast="0"/>
-      <w:bookmarkEnd w:id="21"/>
+      <w:bookmarkStart w:id="22" w:name="_wulbjywgoa5v" w:colFirst="0" w:colLast="0"/>
+      <w:bookmarkEnd w:id="22"/>
     </w:p>
     <w:p/>
     <w:p>
@@ -2383,8 +2264,8 @@
           <w:szCs w:val="24"/>
         </w:rPr>
       </w:pPr>
-      <w:bookmarkStart w:id="22" w:name="_6mfjq8xl7nqa" w:colFirst="0" w:colLast="0"/>
-      <w:bookmarkEnd w:id="22"/>
+      <w:bookmarkStart w:id="23" w:name="_6mfjq8xl7nqa" w:colFirst="0" w:colLast="0"/>
+      <w:bookmarkEnd w:id="23"/>
       <w:r>
         <w:rPr>
           <w:noProof/>
@@ -2412,7 +2293,7 @@
                     <pic:cNvPicPr preferRelativeResize="0"/>
                   </pic:nvPicPr>
                   <pic:blipFill>
-                    <a:blip r:embed="rId24"/>
+                    <a:blip r:embed="rId28"/>
                     <a:srcRect l="45416" t="2962" r="4894"/>
                     <a:stretch>
                       <a:fillRect/>
@@ -2445,8 +2326,8 @@
           <w:szCs w:val="24"/>
         </w:rPr>
       </w:pPr>
-      <w:bookmarkStart w:id="23" w:name="_4wo00krbk9cq" w:colFirst="0" w:colLast="0"/>
-      <w:bookmarkEnd w:id="23"/>
+      <w:bookmarkStart w:id="24" w:name="_4wo00krbk9cq" w:colFirst="0" w:colLast="0"/>
+      <w:bookmarkEnd w:id="24"/>
       <w:r>
         <w:rPr>
           <w:color w:val="666666"/>
@@ -2461,8 +2342,8 @@
         <w:pStyle w:val="Ttulo1"/>
         <w:spacing w:line="276" w:lineRule="auto"/>
       </w:pPr>
-      <w:bookmarkStart w:id="24" w:name="_splfhzsx1su9" w:colFirst="0" w:colLast="0"/>
-      <w:bookmarkEnd w:id="24"/>
+      <w:bookmarkStart w:id="25" w:name="_splfhzsx1su9" w:colFirst="0" w:colLast="0"/>
+      <w:bookmarkEnd w:id="25"/>
       <w:r>
         <w:rPr>
           <w:sz w:val="40"/>
@@ -2591,7 +2472,7 @@
         </w:rPr>
         <w:t xml:space="preserve">More details at </w:t>
       </w:r>
-      <w:hyperlink r:id="rId25">
+      <w:hyperlink r:id="rId29">
         <w:r>
           <w:rPr>
             <w:b/>
@@ -2626,6 +2507,49 @@
     </w:sectPr>
   </w:body>
 </w:document>
+</file>
+
+<file path=word/comments.xml><?xml version="1.0" encoding="utf-8"?>
+<w:comments xmlns:wpc="http://schemas.microsoft.com/office/word/2010/wordprocessingCanvas" xmlns:cx="http://schemas.microsoft.com/office/drawing/2014/chartex" xmlns:cx1="http://schemas.microsoft.com/office/drawing/2015/9/8/chartex" xmlns:cx2="http://schemas.microsoft.com/office/drawing/2015/10/21/chartex" xmlns:cx3="http://schemas.microsoft.com/office/drawing/2016/5/9/chartex" xmlns:cx4="http://schemas.microsoft.com/office/drawing/2016/5/10/chartex" xmlns:cx5="http://schemas.microsoft.com/office/drawing/2016/5/11/chartex" xmlns:cx6="http://schemas.microsoft.com/office/drawing/2016/5/12/chartex" xmlns:cx7="http://schemas.microsoft.com/office/drawing/2016/5/13/chartex" xmlns:cx8="http://schemas.microsoft.com/office/drawing/2016/5/14/chartex" xmlns:mc="http://schemas.openxmlformats.org/markup-compatibility/2006" xmlns:aink="http://schemas.microsoft.com/office/drawing/2016/ink" xmlns:am3d="http://schemas.microsoft.com/office/drawing/2017/model3d" xmlns:o="urn:schemas-microsoft-com:office:office" xmlns:oel="http://schemas.microsoft.com/office/2019/extlst" xmlns:r="http://schemas.openxmlformats.org/officeDocument/2006/relationships" xmlns:m="http://schemas.openxmlformats.org/officeDocument/2006/math" xmlns:v="urn:schemas-microsoft-com:vml" xmlns:wp14="http://schemas.microsoft.com/office/word/2010/wordprocessingDrawing" xmlns:wp="http://schemas.openxmlformats.org/drawingml/2006/wordprocessingDrawing" xmlns:w10="urn:schemas-microsoft-com:office:word" xmlns:w="http://schemas.openxmlformats.org/wordprocessingml/2006/main" xmlns:w14="http://schemas.microsoft.com/office/word/2010/wordml" xmlns:w15="http://schemas.microsoft.com/office/word/2012/wordml" xmlns:w16cex="http://schemas.microsoft.com/office/word/2018/wordml/cex" xmlns:w16cid="http://schemas.microsoft.com/office/word/2016/wordml/cid" xmlns:w16="http://schemas.microsoft.com/office/word/2018/wordml" xmlns:w16du="http://schemas.microsoft.com/office/word/2023/wordml/word16du" xmlns:w16sdtdh="http://schemas.microsoft.com/office/word/2020/wordml/sdtdatahash" xmlns:w16sdtfl="http://schemas.microsoft.com/office/word/2024/wordml/sdtformatlock" xmlns:w16se="http://schemas.microsoft.com/office/word/2015/wordml/symex" xmlns:wpg="http://schemas.microsoft.com/office/word/2010/wordprocessingGroup" xmlns:wpi="http://schemas.microsoft.com/office/word/2010/wordprocessingInk" xmlns:wne="http://schemas.microsoft.com/office/word/2006/wordml" xmlns:wps="http://schemas.microsoft.com/office/word/2010/wordprocessingShape" mc:Ignorable="w14 w15 w16se w16cid w16 w16cex w16sdtdh w16sdtfl w16du wp14">
+  <w:comment w:id="7" w:author="Renzo Saucedo" w:date="2026-06-29T20:28:00Z" w:initials="RS">
+    <w:p>
+      <w:pPr>
+        <w:pStyle w:val="Textocomentario"/>
+        <w:jc w:val="left"/>
+      </w:pPr>
+      <w:r>
+        <w:rPr>
+          <w:rStyle w:val="Refdecomentario"/>
+        </w:rPr>
+        <w:annotationRef/>
+      </w:r>
+      <w:r>
+        <w:rPr>
+          <w:lang w:val="es-PE"/>
+        </w:rPr>
+        <w:t>Definir si el cliente va dentro de usuario final</w:t>
+      </w:r>
+    </w:p>
+  </w:comment>
+</w:comments>
+</file>
+
+<file path=word/commentsExtended.xml><?xml version="1.0" encoding="utf-8"?>
+<w15:commentsEx xmlns:wpc="http://schemas.microsoft.com/office/word/2010/wordprocessingCanvas" xmlns:cx="http://schemas.microsoft.com/office/drawing/2014/chartex" xmlns:cx1="http://schemas.microsoft.com/office/drawing/2015/9/8/chartex" xmlns:cx2="http://schemas.microsoft.com/office/drawing/2015/10/21/chartex" xmlns:cx3="http://schemas.microsoft.com/office/drawing/2016/5/9/chartex" xmlns:cx4="http://schemas.microsoft.com/office/drawing/2016/5/10/chartex" xmlns:cx5="http://schemas.microsoft.com/office/drawing/2016/5/11/chartex" xmlns:cx6="http://schemas.microsoft.com/office/drawing/2016/5/12/chartex" xmlns:cx7="http://schemas.microsoft.com/office/drawing/2016/5/13/chartex" xmlns:cx8="http://schemas.microsoft.com/office/drawing/2016/5/14/chartex" xmlns:mc="http://schemas.openxmlformats.org/markup-compatibility/2006" xmlns:aink="http://schemas.microsoft.com/office/drawing/2016/ink" xmlns:am3d="http://schemas.microsoft.com/office/drawing/2017/model3d" xmlns:o="urn:schemas-microsoft-com:office:office" xmlns:oel="http://schemas.microsoft.com/office/2019/extlst" xmlns:r="http://schemas.openxmlformats.org/officeDocument/2006/relationships" xmlns:m="http://schemas.openxmlformats.org/officeDocument/2006/math" xmlns:v="urn:schemas-microsoft-com:vml" xmlns:wp14="http://schemas.microsoft.com/office/word/2010/wordprocessingDrawing" xmlns:wp="http://schemas.openxmlformats.org/drawingml/2006/wordprocessingDrawing" xmlns:w10="urn:schemas-microsoft-com:office:word" xmlns:w="http://schemas.openxmlformats.org/wordprocessingml/2006/main" xmlns:w14="http://schemas.microsoft.com/office/word/2010/wordml" xmlns:w15="http://schemas.microsoft.com/office/word/2012/wordml" xmlns:w16cex="http://schemas.microsoft.com/office/word/2018/wordml/cex" xmlns:w16cid="http://schemas.microsoft.com/office/word/2016/wordml/cid" xmlns:w16="http://schemas.microsoft.com/office/word/2018/wordml" xmlns:w16du="http://schemas.microsoft.com/office/word/2023/wordml/word16du" xmlns:w16sdtdh="http://schemas.microsoft.com/office/word/2020/wordml/sdtdatahash" xmlns:w16sdtfl="http://schemas.microsoft.com/office/word/2024/wordml/sdtformatlock" xmlns:w16se="http://schemas.microsoft.com/office/word/2015/wordml/symex" xmlns:wpg="http://schemas.microsoft.com/office/word/2010/wordprocessingGroup" xmlns:wpi="http://schemas.microsoft.com/office/word/2010/wordprocessingInk" xmlns:wne="http://schemas.microsoft.com/office/word/2006/wordml" xmlns:wps="http://schemas.microsoft.com/office/word/2010/wordprocessingShape" mc:Ignorable="w14 w15 w16se w16cid w16 w16cex w16sdtdh w16sdtfl w16du wp14">
+  <w15:commentEx w15:paraId="13ABAC3E" w15:done="0"/>
+</w15:commentsEx>
+</file>
+
+<file path=word/commentsExtensible.xml><?xml version="1.0" encoding="utf-8"?>
+<w16cex:commentsExtensible xmlns:wpc="http://schemas.microsoft.com/office/word/2010/wordprocessingCanvas" xmlns:cx="http://schemas.microsoft.com/office/drawing/2014/chartex" xmlns:cx1="http://schemas.microsoft.com/office/drawing/2015/9/8/chartex" xmlns:cx2="http://schemas.microsoft.com/office/drawing/2015/10/21/chartex" xmlns:cx3="http://schemas.microsoft.com/office/drawing/2016/5/9/chartex" xmlns:cx4="http://schemas.microsoft.com/office/drawing/2016/5/10/chartex" xmlns:cx5="http://schemas.microsoft.com/office/drawing/2016/5/11/chartex" xmlns:cx6="http://schemas.microsoft.com/office/drawing/2016/5/12/chartex" xmlns:cx7="http://schemas.microsoft.com/office/drawing/2016/5/13/chartex" xmlns:cx8="http://schemas.microsoft.com/office/drawing/2016/5/14/chartex" xmlns:cr="http://schemas.microsoft.com/office/comments/2020/reactions" xmlns:mc="http://schemas.openxmlformats.org/markup-compatibility/2006" xmlns:aink="http://schemas.microsoft.com/office/drawing/2016/ink" xmlns:am3d="http://schemas.microsoft.com/office/drawing/2017/model3d" xmlns:o="urn:schemas-microsoft-com:office:office" xmlns:oel="http://schemas.microsoft.com/office/2019/extlst" xmlns:r="http://schemas.openxmlformats.org/officeDocument/2006/relationships" xmlns:m="http://schemas.openxmlformats.org/officeDocument/2006/math" xmlns:v="urn:schemas-microsoft-com:vml" xmlns:wp14="http://schemas.microsoft.com/office/word/2010/wordprocessingDrawing" xmlns:wp="http://schemas.openxmlformats.org/drawingml/2006/wordprocessingDrawing" xmlns:w10="urn:schemas-microsoft-com:office:word" xmlns:w="http://schemas.openxmlformats.org/wordprocessingml/2006/main" xmlns:w14="http://schemas.microsoft.com/office/word/2010/wordml" xmlns:w15="http://schemas.microsoft.com/office/word/2012/wordml" xmlns:w16cex="http://schemas.microsoft.com/office/word/2018/wordml/cex" xmlns:w16cid="http://schemas.microsoft.com/office/word/2016/wordml/cid" xmlns:w16="http://schemas.microsoft.com/office/word/2018/wordml" xmlns:w16du="http://schemas.microsoft.com/office/word/2023/wordml/word16du" xmlns:w16sdtdh="http://schemas.microsoft.com/office/word/2020/wordml/sdtdatahash" xmlns:w16sdtfl="http://schemas.microsoft.com/office/word/2024/wordml/sdtformatlock" xmlns:w16se="http://schemas.microsoft.com/office/word/2015/wordml/symex" xmlns:wpg="http://schemas.microsoft.com/office/word/2010/wordprocessingGroup" xmlns:wpi="http://schemas.microsoft.com/office/word/2010/wordprocessingInk" xmlns:wne="http://schemas.microsoft.com/office/word/2006/wordml" xmlns:wps="http://schemas.microsoft.com/office/word/2010/wordprocessingShape" mc:Ignorable="w14 w15 w16se w16cid w16 w16cex w16sdtdh w16sdtfl cr w16du wp14">
+  <w16cex:commentExtensible w16cex:durableId="7FB6D0CA" w16cex:dateUtc="2026-06-30T01:28:00Z"/>
+</w16cex:commentsExtensible>
+</file>
+
+<file path=word/commentsIds.xml><?xml version="1.0" encoding="utf-8"?>
+<w16cid:commentsIds xmlns:wpc="http://schemas.microsoft.com/office/word/2010/wordprocessingCanvas" xmlns:cx="http://schemas.microsoft.com/office/drawing/2014/chartex" xmlns:cx1="http://schemas.microsoft.com/office/drawing/2015/9/8/chartex" xmlns:cx2="http://schemas.microsoft.com/office/drawing/2015/10/21/chartex" xmlns:cx3="http://schemas.microsoft.com/office/drawing/2016/5/9/chartex" xmlns:cx4="http://schemas.microsoft.com/office/drawing/2016/5/10/chartex" xmlns:cx5="http://schemas.microsoft.com/office/drawing/2016/5/11/chartex" xmlns:cx6="http://schemas.microsoft.com/office/drawing/2016/5/12/chartex" xmlns:cx7="http://schemas.microsoft.com/office/drawing/2016/5/13/chartex" xmlns:cx8="http://schemas.microsoft.com/office/drawing/2016/5/14/chartex" xmlns:mc="http://schemas.openxmlformats.org/markup-compatibility/2006" xmlns:aink="http://schemas.microsoft.com/office/drawing/2016/ink" xmlns:am3d="http://schemas.microsoft.com/office/drawing/2017/model3d" xmlns:o="urn:schemas-microsoft-com:office:office" xmlns:oel="http://schemas.microsoft.com/office/2019/extlst" xmlns:r="http://schemas.openxmlformats.org/officeDocument/2006/relationships" xmlns:m="http://schemas.openxmlformats.org/officeDocument/2006/math" xmlns:v="urn:schemas-microsoft-com:vml" xmlns:wp14="http://schemas.microsoft.com/office/word/2010/wordprocessingDrawing" xmlns:wp="http://schemas.openxmlformats.org/drawingml/2006/wordprocessingDrawing" xmlns:w10="urn:schemas-microsoft-com:office:word" xmlns:w="http://schemas.openxmlformats.org/wordprocessingml/2006/main" xmlns:w14="http://schemas.microsoft.com/office/word/2010/wordml" xmlns:w15="http://schemas.microsoft.com/office/word/2012/wordml" xmlns:w16cex="http://schemas.microsoft.com/office/word/2018/wordml/cex" xmlns:w16cid="http://schemas.microsoft.com/office/word/2016/wordml/cid" xmlns:w16="http://schemas.microsoft.com/office/word/2018/wordml" xmlns:w16du="http://schemas.microsoft.com/office/word/2023/wordml/word16du" xmlns:w16sdtdh="http://schemas.microsoft.com/office/word/2020/wordml/sdtdatahash" xmlns:w16sdtfl="http://schemas.microsoft.com/office/word/2024/wordml/sdtformatlock" xmlns:w16se="http://schemas.microsoft.com/office/word/2015/wordml/symex" xmlns:wpg="http://schemas.microsoft.com/office/word/2010/wordprocessingGroup" xmlns:wpi="http://schemas.microsoft.com/office/word/2010/wordprocessingInk" xmlns:wne="http://schemas.microsoft.com/office/word/2006/wordml" xmlns:wps="http://schemas.microsoft.com/office/word/2010/wordprocessingShape" mc:Ignorable="w14 w15 w16se w16cid w16 w16cex w16sdtdh w16sdtfl w16du wp14">
+  <w16cid:commentId w16cid:paraId="13ABAC3E" w16cid:durableId="7FB6D0CA"/>
+</w16cid:commentsIds>
 </file>
 
 <file path=word/numbering.xml><?xml version="1.0" encoding="utf-8"?>
@@ -2747,6 +2671,14 @@
     <w:abstractNumId w:val="0"/>
   </w:num>
 </w:numbering>
+</file>
+
+<file path=word/people.xml><?xml version="1.0" encoding="utf-8"?>
+<w15:people xmlns:wpc="http://schemas.microsoft.com/office/word/2010/wordprocessingCanvas" xmlns:cx="http://schemas.microsoft.com/office/drawing/2014/chartex" xmlns:cx1="http://schemas.microsoft.com/office/drawing/2015/9/8/chartex" xmlns:cx2="http://schemas.microsoft.com/office/drawing/2015/10/21/chartex" xmlns:cx3="http://schemas.microsoft.com/office/drawing/2016/5/9/chartex" xmlns:cx4="http://schemas.microsoft.com/office/drawing/2016/5/10/chartex" xmlns:cx5="http://schemas.microsoft.com/office/drawing/2016/5/11/chartex" xmlns:cx6="http://schemas.microsoft.com/office/drawing/2016/5/12/chartex" xmlns:cx7="http://schemas.microsoft.com/office/drawing/2016/5/13/chartex" xmlns:cx8="http://schemas.microsoft.com/office/drawing/2016/5/14/chartex" xmlns:mc="http://schemas.openxmlformats.org/markup-compatibility/2006" xmlns:aink="http://schemas.microsoft.com/office/drawing/2016/ink" xmlns:am3d="http://schemas.microsoft.com/office/drawing/2017/model3d" xmlns:o="urn:schemas-microsoft-com:office:office" xmlns:oel="http://schemas.microsoft.com/office/2019/extlst" xmlns:r="http://schemas.openxmlformats.org/officeDocument/2006/relationships" xmlns:m="http://schemas.openxmlformats.org/officeDocument/2006/math" xmlns:v="urn:schemas-microsoft-com:vml" xmlns:wp14="http://schemas.microsoft.com/office/word/2010/wordprocessingDrawing" xmlns:wp="http://schemas.openxmlformats.org/drawingml/2006/wordprocessingDrawing" xmlns:w10="urn:schemas-microsoft-com:office:word" xmlns:w="http://schemas.openxmlformats.org/wordprocessingml/2006/main" xmlns:w14="http://schemas.microsoft.com/office/word/2010/wordml" xmlns:w15="http://schemas.microsoft.com/office/word/2012/wordml" xmlns:w16cex="http://schemas.microsoft.com/office/word/2018/wordml/cex" xmlns:w16cid="http://schemas.microsoft.com/office/word/2016/wordml/cid" xmlns:w16="http://schemas.microsoft.com/office/word/2018/wordml" xmlns:w16du="http://schemas.microsoft.com/office/word/2023/wordml/word16du" xmlns:w16sdtdh="http://schemas.microsoft.com/office/word/2020/wordml/sdtdatahash" xmlns:w16sdtfl="http://schemas.microsoft.com/office/word/2024/wordml/sdtformatlock" xmlns:w16se="http://schemas.microsoft.com/office/word/2015/wordml/symex" xmlns:wpg="http://schemas.microsoft.com/office/word/2010/wordprocessingGroup" xmlns:wpi="http://schemas.microsoft.com/office/word/2010/wordprocessingInk" xmlns:wne="http://schemas.microsoft.com/office/word/2006/wordml" xmlns:wps="http://schemas.microsoft.com/office/word/2010/wordprocessingShape" mc:Ignorable="w14 w15 w16se w16cid w16 w16cex w16sdtdh w16sdtfl w16du wp14">
+  <w15:person w15:author="Renzo Saucedo">
+    <w15:presenceInfo w15:providerId="Windows Live" w15:userId="a2401d50ff5c8343"/>
+  </w15:person>
+</w15:people>
 </file>
 
 <file path=word/styles.xml><?xml version="1.0" encoding="utf-8"?>
@@ -3254,6 +3186,7 @@
   <w:style w:type="character" w:default="1" w:styleId="Fuentedeprrafopredeter">
     <w:name w:val="Default Paragraph Font"/>
     <w:uiPriority w:val="1"/>
+    <w:semiHidden/>
     <w:unhideWhenUsed/>
   </w:style>
   <w:style w:type="table" w:default="1" w:styleId="Tablanormal">
@@ -3360,6 +3293,69 @@
       <w:ind w:left="720"/>
       <w:contextualSpacing/>
     </w:pPr>
+  </w:style>
+  <w:style w:type="character" w:styleId="Refdecomentario">
+    <w:name w:val="annotation reference"/>
+    <w:basedOn w:val="Fuentedeprrafopredeter"/>
+    <w:uiPriority w:val="99"/>
+    <w:semiHidden/>
+    <w:unhideWhenUsed/>
+    <w:rsid w:val="005E03AC"/>
+    <w:rPr>
+      <w:sz w:val="16"/>
+      <w:szCs w:val="16"/>
+    </w:rPr>
+  </w:style>
+  <w:style w:type="paragraph" w:styleId="Textocomentario">
+    <w:name w:val="annotation text"/>
+    <w:basedOn w:val="Normal"/>
+    <w:link w:val="TextocomentarioCar"/>
+    <w:uiPriority w:val="99"/>
+    <w:unhideWhenUsed/>
+    <w:rsid w:val="005E03AC"/>
+    <w:rPr>
+      <w:sz w:val="20"/>
+      <w:szCs w:val="20"/>
+    </w:rPr>
+  </w:style>
+  <w:style w:type="character" w:customStyle="1" w:styleId="TextocomentarioCar">
+    <w:name w:val="Texto comentario Car"/>
+    <w:basedOn w:val="Fuentedeprrafopredeter"/>
+    <w:link w:val="Textocomentario"/>
+    <w:uiPriority w:val="99"/>
+    <w:rsid w:val="005E03AC"/>
+    <w:rPr>
+      <w:sz w:val="20"/>
+      <w:szCs w:val="20"/>
+    </w:rPr>
+  </w:style>
+  <w:style w:type="paragraph" w:styleId="Asuntodelcomentario">
+    <w:name w:val="annotation subject"/>
+    <w:basedOn w:val="Textocomentario"/>
+    <w:next w:val="Textocomentario"/>
+    <w:link w:val="AsuntodelcomentarioCar"/>
+    <w:uiPriority w:val="99"/>
+    <w:semiHidden/>
+    <w:unhideWhenUsed/>
+    <w:rsid w:val="005E03AC"/>
+    <w:rPr>
+      <w:b/>
+      <w:bCs/>
+    </w:rPr>
+  </w:style>
+  <w:style w:type="character" w:customStyle="1" w:styleId="AsuntodelcomentarioCar">
+    <w:name w:val="Asunto del comentario Car"/>
+    <w:basedOn w:val="TextocomentarioCar"/>
+    <w:link w:val="Asuntodelcomentario"/>
+    <w:uiPriority w:val="99"/>
+    <w:semiHidden/>
+    <w:rsid w:val="005E03AC"/>
+    <w:rPr>
+      <w:b/>
+      <w:bCs/>
+      <w:sz w:val="20"/>
+      <w:szCs w:val="20"/>
+    </w:rPr>
   </w:style>
 </w:styles>
 </file>

</xml_diff>